<commit_message>
added new article and linked through index
</commit_message>
<xml_diff>
--- a/Articles/WHAT IS TUITION ASSISTANCE AND HOW DOES IT WORK.docx
+++ b/Articles/WHAT IS TUITION ASSISTANCE AND HOW DOES IT WORK.docx
@@ -14,7 +14,21 @@
           <w:b/>
           <w:bCs/>
         </w:rPr>
-        <w:t>WHAT IS TUITION AND HOW DOES IT WORK? (A CHEAT SHEET)</w:t>
+        <w:t>WHAT IS TUITION</w:t>
+      </w:r>
+      <w:r>
+        <w:rPr>
+          <w:b/>
+          <w:bCs/>
+        </w:rPr>
+        <w:t xml:space="preserve"> ASSISTANCE</w:t>
+      </w:r>
+      <w:r>
+        <w:rPr>
+          <w:b/>
+          <w:bCs/>
+        </w:rPr>
+        <w:t xml:space="preserve"> AND HOW DOES IT WORK? (A CHEAT SHEET)</w:t>
       </w:r>
     </w:p>
     <w:p>

</xml_diff>